<commit_message>
sugerencias manuales: el modal se completa con tres frases (opcion A)
En vez de combinar Dias / Unidades / Mantener stock con "Repetir cada N dias"
y una fecha limite, se completa una frase y se ve cuanto se compra hoy:
- "N unidades mas, una sola vez": vence a los 7 dias por defecto y se cierra
  sola al marcar el producto como pedido.
- "nunca haya menos de N" y "alcance para N dias de venta": reglas diarias que
  piden solo lo que falta.
- Si ya hay una para el mismo producto y sucursal, pregunta reemplazar o sumar.

Servidor: contexto del par para el modal, reemplazar al crear, marcar como
pedido cierra las sugerencias del producto y un endpoint de admin para que el
motor aplique las reglas cada dia (el workflow de GitHub fallaba con 403).
El conteo de "Varios productos" ahora respeta el filtro de proveedor, y la
regla por grupo dice su proveedor.

Modelo, asistente y Word explican el comportamiento nuevo.

Co-Authored-By: Claude Opus 5.5 <noreply@anthropic.com>
</commit_message>
<xml_diff>
--- a/apps/web/public/modelo-sugerido-de-compras.docx
+++ b/apps/web/public/modelo-sugerido-de-compras.docx
@@ -2235,7 +2235,15 @@
           <w:b/>
           <w:bCs/>
         </w:rPr>
-        <w:t xml:space="preserve">Cuánto pide: Días, Unidades y Mantener stock</w:t>
+        <w:t xml:space="preserve">Las tres frases</w:t>
+      </w:r>
+    </w:p>
+    <w:p>
+      <w:pPr>
+        <w:spacing w:after="120"/>
+      </w:pPr>
+      <w:r>
+        <w:t xml:space="preserve">El modal pide completar una frase. Antes de guardar muestra cuánto se compra hoy en total y para cuántos días de venta alcanza.</w:t>
       </w:r>
     </w:p>
     <w:tbl>
@@ -2295,7 +2303,7 @@
                 <w:bCs/>
                 <w:color w:val="FFFFFF"/>
               </w:rPr>
-              <w:t xml:space="preserve">Modo</w:t>
+              <w:t xml:space="preserve">Frase</w:t>
             </w:r>
           </w:p>
         </w:tc>
@@ -2384,7 +2392,7 @@
           </w:tcPr>
           <w:p>
             <w:r>
-              <w:t xml:space="preserve">Días: los días de venta que quieres tener cubiertos</w:t>
+              <w:t xml:space="preserve">Quiero N unidades más, una sola vez. (compra puntual)</w:t>
             </w:r>
           </w:p>
         </w:tc>
@@ -2407,7 +2415,7 @@
           </w:tcPr>
           <w:p>
             <w:r>
-              <w:t xml:space="preserve">Lo que falta para cubrir esos días según la demanda diaria del modelo. Descuenta el stock, lo que viene en tránsito y lo que el sistema ya sugiere.</w:t>
+              <w:t xml:space="preserve">Exactamente N, encima de lo que sugiere el sistema. No mira el stock ni el tránsito.</w:t>
             </w:r>
           </w:p>
         </w:tc>
@@ -2430,7 +2438,7 @@
           </w:tcPr>
           <w:p>
             <w:r>
-              <w:t xml:space="preserve">Si lo que hay ya alcanza para esos días. Tampoco sirve si el producto no tiene demanda registrada en esa sucursal.</w:t>
+              <w:t xml:space="preserve">Nunca: siempre suma mientras está vigente.</w:t>
             </w:r>
           </w:p>
         </w:tc>
@@ -2461,7 +2469,7 @@
           </w:tcPr>
           <w:p>
             <w:r>
-              <w:t xml:space="preserve">Unidades: una cantidad fija</w:t>
+              <w:t xml:space="preserve">Quiero que nunca haya menos de N unidades. (regla diaria)</w:t>
             </w:r>
           </w:p>
         </w:tc>
@@ -2484,7 +2492,7 @@
           </w:tcPr>
           <w:p>
             <w:r>
-              <w:t xml:space="preserve">Exactamente esas unidades, encima de lo que sugiere el sistema. No mira el stock ni el tránsito.</w:t>
+              <w:t xml:space="preserve">Lo que falta para llegar a N. Descuenta el stock, lo que viene en tránsito y lo que el sistema ya sugiere.</w:t>
             </w:r>
           </w:p>
         </w:tc>
@@ -2507,7 +2515,7 @@
           </w:tcPr>
           <w:p>
             <w:r>
-              <w:t xml:space="preserve">Nunca: siempre suma, aunque la sucursal tenga de sobra.</w:t>
+              <w:t xml:space="preserve">Cuando el nivel ya está cubierto. No compra todos los días: solo cuando el stock baja.</w:t>
             </w:r>
           </w:p>
         </w:tc>
@@ -2538,7 +2546,7 @@
           </w:tcPr>
           <w:p>
             <w:r>
-              <w:t xml:space="preserve">Mantener stock: el nivel que quieres tener en bodega</w:t>
+              <w:t xml:space="preserve">Quiero que siempre alcance para N días de venta. (regla diaria)</w:t>
             </w:r>
           </w:p>
         </w:tc>
@@ -2561,7 +2569,7 @@
           </w:tcPr>
           <w:p>
             <w:r>
-              <w:t xml:space="preserve">Lo que falta para llegar a ese nivel. Descuenta el stock, lo que viene en tránsito y lo que el sistema ya sugiere.</w:t>
+              <w:t xml:space="preserve">Lo que falta para cubrir N días según la demanda diaria del modelo. Descuenta lo mismo que la anterior.</w:t>
             </w:r>
           </w:p>
         </w:tc>
@@ -2584,7 +2592,7 @@
           </w:tcPr>
           <w:p>
             <w:r>
-              <w:t xml:space="preserve">Si el nivel ya está cubierto. Sirve también para productos que el modelo no pide: ahí mira el stock de bodega.</w:t>
+              <w:t xml:space="preserve">Cuando lo que hay ya alcanza. Sin venta registrada en esa sucursal no se puede: el modal propone “nunca haya menos de”.</w:t>
             </w:r>
           </w:p>
         </w:tc>
@@ -2745,7 +2753,7 @@
                 <w:bCs/>
                 <w:color w:val="FFFFFF"/>
               </w:rPr>
-              <w:t xml:space="preserve">Se pide (total a comprar)</w:t>
+              <w:t xml:space="preserve">Se pide (total a comprar hoy)</w:t>
             </w:r>
           </w:p>
         </w:tc>
@@ -2776,7 +2784,7 @@
           </w:tcPr>
           <w:p>
             <w:r>
-              <w:t xml:space="preserve">Días: 30</w:t>
+              <w:t xml:space="preserve">7 unidades más, una sola vez</w:t>
             </w:r>
           </w:p>
         </w:tc>
@@ -2799,7 +2807,7 @@
           </w:tcPr>
           <w:p>
             <w:r>
-              <w:t xml:space="preserve">0,8 × 30 = 24 → 24 − 5 − 2 − 3</w:t>
+              <w:t xml:space="preserve">No descuenta nada</w:t>
             </w:r>
           </w:p>
         </w:tc>
@@ -2822,7 +2830,7 @@
           </w:tcPr>
           <w:p>
             <w:r>
-              <w:t xml:space="preserve">14 (17 con los 3 del sistema)</w:t>
+              <w:t xml:space="preserve">7 (10 con los 3 del sistema)</w:t>
             </w:r>
           </w:p>
         </w:tc>
@@ -2853,7 +2861,7 @@
           </w:tcPr>
           <w:p>
             <w:r>
-              <w:t xml:space="preserve">Mantener stock: 12</w:t>
+              <w:t xml:space="preserve">Nunca menos de 12</w:t>
             </w:r>
           </w:p>
         </w:tc>
@@ -2930,7 +2938,7 @@
           </w:tcPr>
           <w:p>
             <w:r>
-              <w:t xml:space="preserve">Unidades: 10</w:t>
+              <w:t xml:space="preserve">Que alcance para 30 días</w:t>
             </w:r>
           </w:p>
         </w:tc>
@@ -2953,7 +2961,7 @@
           </w:tcPr>
           <w:p>
             <w:r>
-              <w:t xml:space="preserve">No descuenta nada</w:t>
+              <w:t xml:space="preserve">0,8 × 30 = 24 → 24 − 5 − 2 − 3</w:t>
             </w:r>
           </w:p>
         </w:tc>
@@ -2976,7 +2984,7 @@
           </w:tcPr>
           <w:p>
             <w:r>
-              <w:t xml:space="preserve">10 (13)</w:t>
+              <w:t xml:space="preserve">14 (17)</w:t>
             </w:r>
           </w:p>
         </w:tc>
@@ -2996,19 +3004,125 @@
           <w:b/>
           <w:bCs/>
         </w:rPr>
-        <w:t xml:space="preserve">Las unidades se calculan una sola vez, al guardar.</w:t>
-      </w:r>
-      <w:r>
-        <w:t xml:space="preserve"> Desde ahí la sugerencia suma ese mismo número todos los días hasta su fecha límite, aunque el stock cambie o la mercadería ya haya llegado. Para que se recalcule sola, usa Repetir periódicamente. Dos sugerencias manuales del mismo producto y sucursal se suman entre sí.</w:t>
-      </w:r>
-    </w:p>
-    <w:p>
-      <w:r>
-        <w:rPr>
-          <w:b/>
-          <w:bCs/>
-        </w:rPr>
-        <w:t xml:space="preserve">A qué productos se aplica: Individual, Por grupo, Todos y Pegar lista</w:t>
+        <w:t xml:space="preserve">Las reglas se recalculan todos los días,</w:t>
+      </w:r>
+      <w:r>
+        <w:t xml:space="preserve"> al final de la corrida del motor, con el stock, el tránsito y el sugerido del día. Lo que ya viene en camino no se vuelve a pedir. Lo de una sola vez suma el mismo número cada día hasta que se marque como pedido o se borre.</w:t>
+      </w:r>
+    </w:p>
+    <w:p>
+      <w:r>
+        <w:rPr>
+          <w:b/>
+          <w:bCs/>
+        </w:rPr>
+        <w:t xml:space="preserve">Si ya hay una para el mismo producto</w:t>
+      </w:r>
+    </w:p>
+    <w:p>
+      <w:pPr>
+        <w:spacing w:after="120"/>
+      </w:pPr>
+      <w:r>
+        <w:t xml:space="preserve">Dos sugerencias del mismo producto y sucursal se suman entre sí. Si ya hay una sugerencia o una regla para ese producto en esa sucursal, el modal la muestra y pregunta: Reemplazarla (lo normal: se cierra la anterior y queda la nueva) o Sumar las dos. Lo que viene de una regla de varios productos no se toca.</w:t>
+      </w:r>
+    </w:p>
+    <w:p>
+      <w:r>
+        <w:rPr>
+          <w:b/>
+          <w:bCs/>
+        </w:rPr>
+        <w:t xml:space="preserve">Cuándo se borra</w:t>
+      </w:r>
+    </w:p>
+    <w:p>
+      <w:pPr>
+        <w:pStyle w:val="Prrafodelista"/>
+        <w:numPr>
+          <w:ilvl w:val="0"/>
+          <w:numId w:val="2"/>
+        </w:numPr>
+        <w:spacing w:after="70"/>
+      </w:pPr>
+      <w:r>
+        <w:rPr>
+          <w:b/>
+          <w:bCs/>
+        </w:rPr>
+        <w:t xml:space="preserve">Al marcar el producto como pedido</w:t>
+      </w:r>
+      <w:r>
+        <w:t xml:space="preserve"> en Compras se cierran sus sugerencias manuales en esa sucursal. Si venía de una regla, la regla sigue y al día siguiente recalcula con lo que ya viene en camino.</w:t>
+      </w:r>
+    </w:p>
+    <w:p>
+      <w:pPr>
+        <w:pStyle w:val="Prrafodelista"/>
+        <w:numPr>
+          <w:ilvl w:val="0"/>
+          <w:numId w:val="2"/>
+        </w:numPr>
+        <w:spacing w:after="70"/>
+      </w:pPr>
+      <w:r>
+        <w:rPr>
+          <w:b/>
+          <w:bCs/>
+        </w:rPr>
+        <w:t xml:space="preserve">Si nadie la compra,</w:t>
+      </w:r>
+      <w:r>
+        <w:t xml:space="preserve"> la de una sola vez se borra a los 7 días. En “Más opciones” se puede elegir 14 o 30 días, o Nunca: con Nunca sigue sumándose hasta que se marque como pedida o se borre.</w:t>
+      </w:r>
+    </w:p>
+    <w:p>
+      <w:pPr>
+        <w:pStyle w:val="Prrafodelista"/>
+        <w:numPr>
+          <w:ilvl w:val="0"/>
+          <w:numId w:val="2"/>
+        </w:numPr>
+        <w:spacing w:after="70"/>
+      </w:pPr>
+      <w:r>
+        <w:rPr>
+          <w:b/>
+          <w:bCs/>
+        </w:rPr>
+        <w:t xml:space="preserve">Las reglas siguen hasta que se borren,</w:t>
+      </w:r>
+      <w:r>
+        <w:t xml:space="preserve"> o hasta la fecha que se elija en “¿Hasta cuándo?”.</w:t>
+      </w:r>
+    </w:p>
+    <w:p>
+      <w:pPr>
+        <w:pStyle w:val="Prrafodelista"/>
+        <w:numPr>
+          <w:ilvl w:val="0"/>
+          <w:numId w:val="2"/>
+        </w:numPr>
+        <w:spacing w:after="70"/>
+      </w:pPr>
+      <w:r>
+        <w:rPr>
+          <w:b/>
+          <w:bCs/>
+        </w:rPr>
+        <w:t xml:space="preserve">Para corregir o borrar,</w:t>
+      </w:r>
+      <w:r>
+        <w:t xml:space="preserve"> la página Sugerencias manuales lista cada una con su motivo: se elimina una sola, una carga completa o una regla.</w:t>
+      </w:r>
+    </w:p>
+    <w:p>
+      <w:r>
+        <w:rPr>
+          <w:b/>
+          <w:bCs/>
+        </w:rPr>
+        <w:t xml:space="preserve">A qué productos se aplica: Un producto, Varios productos y Pegar lista</w:t>
       </w:r>
     </w:p>
     <w:tbl>
@@ -3157,7 +3271,7 @@
           </w:tcPr>
           <w:p>
             <w:r>
-              <w:t xml:space="preserve">Individual</w:t>
+              <w:t xml:space="preserve">Un producto</w:t>
             </w:r>
           </w:p>
         </w:tc>
@@ -3203,7 +3317,7 @@
           </w:tcPr>
           <w:p>
             <w:r>
-              <w:t xml:space="preserve">En Días y Mantener stock, antes de guardar muestra de dónde sale el número. Si ya está cubierto, avisa y no guarda nada, salvo que sea una regla con Repetir. Rechaza códigos que no existen y avisa si FORD reemplazó el código.</w:t>
+              <w:t xml:space="preserve">Muestra el stock, lo que viene en camino, lo que ya pide el sistema y la venta diaria, y calcula el resultado mientras se escribe. Avisa si el código no existe y si FORD lo reemplazó.</w:t>
             </w:r>
           </w:p>
         </w:tc>
@@ -3234,7 +3348,7 @@
           </w:tcPr>
           <w:p>
             <w:r>
-              <w:t xml:space="preserve">Por grupo</w:t>
+              <w:t xml:space="preserve">Varios productos</w:t>
             </w:r>
           </w:p>
         </w:tc>
@@ -3257,7 +3371,7 @@
           </w:tcPr>
           <w:p>
             <w:r>
-              <w:t xml:space="preserve">Los productos que cumplen a la vez los filtros elegidos: sucursal, proveedor y ABC.</w:t>
+              <w:t xml:space="preserve">Los que cumplen a la vez los filtros de sucursal, proveedor y ABC. Sin filtros, todos.</w:t>
             </w:r>
           </w:p>
         </w:tc>
@@ -3280,7 +3394,7 @@
           </w:tcPr>
           <w:p>
             <w:r>
-              <w:t xml:space="preserve">Mismo modo y número para cada producto × sucursal; antes de guardar dice a cuántos. Omite los cubiertos y, en Días, los sin demanda. Quedan en una misma carga que se borra de una vez.</w:t>
+              <w:t xml:space="preserve">Las mismas tres frases para cada producto × sucursal; antes de guardar dice a cuántos. Viene marcado “Solo productos con Pedir = Sí”. Avisa sobre 1.000 productos.</w:t>
             </w:r>
           </w:p>
         </w:tc>
@@ -3311,7 +3425,7 @@
           </w:tcPr>
           <w:p>
             <w:r>
-              <w:t xml:space="preserve">Todos</w:t>
+              <w:t xml:space="preserve">Pegar lista</w:t>
             </w:r>
           </w:p>
         </w:tc>
@@ -3334,7 +3448,7 @@
           </w:tcPr>
           <w:p>
             <w:r>
-              <w:t xml:space="preserve">Todos los productos del sugerido, sin filtros.</w:t>
+              <w:t xml:space="preserve">Una lista copiada desde Excel.</w:t>
             </w:r>
           </w:p>
         </w:tc>
@@ -3357,158 +3471,12 @@
           </w:tcPr>
           <w:p>
             <w:r>
-              <w:t xml:space="preserve">Igual que Por grupo. Avisa cuando la carga pasa de 1.000 productos.</w:t>
-            </w:r>
-          </w:p>
-        </w:tc>
-      </w:tr>
-      <w:tr>
-        <w:tblPrEx>
-          <w:tblCellMar>
-            <w:top w:w="0" w:type="dxa"/>
-            <w:bottom w:w="0" w:type="dxa"/>
-          </w:tblCellMar>
-        </w:tblPrEx>
-        <w:tc>
-          <w:tcPr>
-            <w:tcW w:w="2600" w:type="dxa"/>
-            <w:tcBorders>
-              <w:top w:val="single" w:sz="1" w:space="0" w:color="CCCCCC"/>
-              <w:left w:val="single" w:sz="1" w:space="0" w:color="CCCCCC"/>
-              <w:bottom w:val="single" w:sz="1" w:space="0" w:color="CCCCCC"/>
-              <w:right w:val="single" w:sz="1" w:space="0" w:color="CCCCCC"/>
-            </w:tcBorders>
-            <w:tcMar>
-              <w:top w:w="70" w:type="dxa"/>
-              <w:left w:w="120" w:type="dxa"/>
-              <w:bottom w:w="70" w:type="dxa"/>
-              <w:right w:w="120" w:type="dxa"/>
-            </w:tcMar>
-            <w:vAlign w:val="center"/>
-          </w:tcPr>
-          <w:p>
-            <w:r>
-              <w:t xml:space="preserve">Pegar lista</w:t>
-            </w:r>
-          </w:p>
-        </w:tc>
-        <w:tc>
-          <w:tcPr>
-            <w:tcW w:w="2600" w:type="dxa"/>
-            <w:tcBorders>
-              <w:top w:val="single" w:sz="1" w:space="0" w:color="CCCCCC"/>
-              <w:left w:val="single" w:sz="1" w:space="0" w:color="CCCCCC"/>
-              <w:bottom w:val="single" w:sz="1" w:space="0" w:color="CCCCCC"/>
-              <w:right w:val="single" w:sz="1" w:space="0" w:color="CCCCCC"/>
-            </w:tcBorders>
-            <w:tcMar>
-              <w:top w:w="70" w:type="dxa"/>
-              <w:left w:w="120" w:type="dxa"/>
-              <w:bottom w:w="70" w:type="dxa"/>
-              <w:right w:w="120" w:type="dxa"/>
-            </w:tcMar>
-            <w:vAlign w:val="center"/>
-          </w:tcPr>
-          <w:p>
-            <w:r>
-              <w:t xml:space="preserve">Una lista copiada desde Excel.</w:t>
-            </w:r>
-          </w:p>
-        </w:tc>
-        <w:tc>
-          <w:tcPr>
-            <w:tcW w:w="4160" w:type="dxa"/>
-            <w:tcBorders>
-              <w:top w:val="single" w:sz="1" w:space="0" w:color="CCCCCC"/>
-              <w:left w:val="single" w:sz="1" w:space="0" w:color="CCCCCC"/>
-              <w:bottom w:val="single" w:sz="1" w:space="0" w:color="CCCCCC"/>
-              <w:right w:val="single" w:sz="1" w:space="0" w:color="CCCCCC"/>
-            </w:tcBorders>
-            <w:tcMar>
-              <w:top w:w="70" w:type="dxa"/>
-              <w:left w:w="120" w:type="dxa"/>
-              <w:bottom w:w="70" w:type="dxa"/>
-              <w:right w:w="120" w:type="dxa"/>
-            </w:tcMar>
-            <w:vAlign w:val="center"/>
-          </w:tcPr>
-          <w:p>
-            <w:r>
-              <w:t xml:space="preserve">Cada línea trae producto, sucursal y su cantidad: unidades, días o mantener. Si trae más de una, manda mantener, después días y al final unidades. Muestra una vista previa antes de guardar.</w:t>
+              <w:t xml:space="preserve">Cada línea trae producto, sucursal y su cantidad: unidades, días o mantener. Se calcula al guardar y se carga una sola vez, con el mismo plazo. Muestra una vista previa antes de guardar.</w:t>
             </w:r>
           </w:p>
         </w:tc>
       </w:tr>
     </w:tbl>
-    <w:p>
-      <w:pPr>
-        <w:pStyle w:val="Prrafodelista"/>
-        <w:numPr>
-          <w:ilvl w:val="0"/>
-          <w:numId w:val="2"/>
-        </w:numPr>
-        <w:spacing w:after="70"/>
-      </w:pPr>
-      <w:r>
-        <w:rPr>
-          <w:b/>
-          <w:bCs/>
-        </w:rPr>
-        <w:t xml:space="preserve">En Por grupo y Todos viene marcado “Solo productos con pedir = Sí”</w:t>
-      </w:r>
-      <w:r>
-        <w:t xml:space="preserve"> (recomendado): así solo se tocan los productos que el modelo ya pide.</w:t>
-      </w:r>
-    </w:p>
-    <w:p>
-      <w:r>
-        <w:rPr>
-          <w:b/>
-          <w:bCs/>
-        </w:rPr>
-        <w:t xml:space="preserve">Fecha límite y Repetir periódicamente</w:t>
-      </w:r>
-    </w:p>
-    <w:p>
-      <w:pPr>
-        <w:pStyle w:val="Prrafodelista"/>
-        <w:numPr>
-          <w:ilvl w:val="0"/>
-          <w:numId w:val="2"/>
-        </w:numPr>
-        <w:spacing w:after="70"/>
-      </w:pPr>
-      <w:r>
-        <w:rPr>
-          <w:b/>
-          <w:bCs/>
-        </w:rPr>
-        <w:t xml:space="preserve">Fecha límite:</w:t>
-      </w:r>
-      <w:r>
-        <w:t xml:space="preserve"> la sugerencia suma a la compra hasta ese día, incluido, y al día siguiente se archiva sola. Sin fecha no vence nunca: pide las mismas unidades todos los días hasta que alguien la borre.</w:t>
-      </w:r>
-    </w:p>
-    <w:p>
-      <w:pPr>
-        <w:pStyle w:val="Prrafodelista"/>
-        <w:numPr>
-          <w:ilvl w:val="0"/>
-          <w:numId w:val="2"/>
-        </w:numPr>
-        <w:spacing w:after="70"/>
-      </w:pPr>
-      <w:r>
-        <w:rPr>
-          <w:b/>
-          <w:bCs/>
-        </w:rPr>
-        <w:t xml:space="preserve">Repetir periódicamente</w:t>
-      </w:r>
-      <w:r>
-        <w:t xml:space="preserve"> convierte la sugerencia en una regla: se aplica al guardar y cada N días, hasta la fecha “Hasta” o hasta eliminarla. Cada repetición reemplaza a la anterior y recalcula: Días con la demanda y el stock del momento, Mantener stock solo lo que falta para volver al nivel, Unidades el mismo número. Mantener stock marca Repetir solo.</w:t>
-      </w:r>
-    </w:p>
     <w:p>
       <w:pPr>
         <w:pStyle w:val="Ttulo2"/>

</xml_diff>